<commit_message>
Replay Studio: agent-organized all-time run history browser
GET /runs/history pages one agent's complete run history straight off the
engine's newest-first cursor stream, with no time floor; the screen becomes
an agent picker plus a cursor-paged run rail. The engine test double's
cursor now streams newest-first descending like the real engine (it was
backwards). Manual updated and republished.

Co-Authored-By: Claude Opus 4.8 <noreply@anthropic.com>
</commit_message>
<xml_diff>
--- a/docs/Fulcrum-Ops-Operator-Manual.docx
+++ b/docs/Fulcrum-Ops-Operator-Manual.docx
@@ -6838,6 +6838,39 @@
         <w:spacing w:lineRule="auto"/>
       </w:pPr>
       <w:r>
+        <w:rPr>
+          <w:b/>
+        </w:rPr>
+        <w:t xml:space="preserve">The run browser.</w:t>
+      </w:r>
+      <w:r>
+        <w:rPr/>
+        <w:t xml:space="preserve"> The rail on the left holds an agent's </w:t>
+      </w:r>
+      <w:r>
+        <w:rPr/>
+        <w:t xml:space="preserve">complete</w:t>
+      </w:r>
+      <w:r>
+        <w:rPr/>
+        <w:t xml:space="preserve"> run  history — pick an agent, and every run it has ever recorded is listed newest first, each row with  its status, time, input preview, tokens and duration. Unlike Live Runs there is no time window:  </w:t>
+      </w:r>
+      <w:r>
+        <w:rPr>
+          <w:b/>
+        </w:rPr>
+        <w:t xml:space="preserve">Load older runs</w:t>
+      </w:r>
+      <w:r>
+        <w:rPr/>
+        <w:t xml:space="preserve"> pages back through the whole history until the rail says  "Full history", so a run from months ago is as reachable as one from this morning. Clicking any  row loads its replay.</w:t>
+      </w:r>
+    </w:p>
+    <w:p>
+      <w:pPr>
+        <w:spacing w:lineRule="auto"/>
+      </w:pPr>
+      <w:r>
         <w:rPr/>
         <w:t xml:space="preserve">Arriving from Live Runs — the row action, the inspector's Replay button, or the trace view —  loads </w:t>
       </w:r>
@@ -6847,7 +6880,7 @@
       </w:r>
       <w:r>
         <w:rPr/>
-        <w:t xml:space="preserve"> run, even when it is older than the recent-runs list the picker shows. A run  that genuinely cannot be loaded says so and leaves the picker usable, rather than quietly  substituting a different execution.</w:t>
+        <w:t xml:space="preserve"> run directly and selects its agent in the browser. A run that genuinely cannot  be loaded says so and leaves the browser usable, rather than quietly substituting a different  execution.</w:t>
       </w:r>
     </w:p>
     <w:p>

</xml_diff>

<commit_message>
Guardrail match_count agrees with its matched payload
The read-time counter only understood the inline checker's envelope
({count, labels, spans}); the SDK's pass-through label->count maps fell
through to zero, so every fleet-reported event rendered 'match_count: 0'
beside real entities (found by a doc-derived test pack). The counter now
totals all three shapes, healing history in place since nothing is stored.
Also: the manual documents the legacy connector types, and Add Connection
offers every agent-platform kind so attributable connections can be
created from the dialog.

Co-Authored-By: Claude Opus 4.8 <noreply@anthropic.com>
</commit_message>
<xml_diff>
--- a/docs/Fulcrum-Ops-Operator-Manual.docx
+++ b/docs/Fulcrum-Ops-Operator-Manual.docx
@@ -7165,7 +7165,7 @@
       </w:r>
       <w:r>
         <w:rPr/>
-        <w:t xml:space="preserve"> takes a name, a kind (</w:t>
+        <w:t xml:space="preserve"> takes a name, a kind, an endpoint URL and free-form  metadata pairs such as Environment or Authentication. The kinds fall in two groups: the agent  platforms (</w:t>
       </w:r>
       <w:r>
         <w:rPr/>
@@ -7173,11 +7173,27 @@
       </w:r>
       <w:r>
         <w:rPr/>
+        <w:t xml:space="preserve">, </w:t>
+      </w:r>
+      <w:r>
+        <w:rPr/>
+        <w:t xml:space="preserve">Copilot Studio</w:t>
+      </w:r>
+      <w:r>
+        <w:rPr/>
+        <w:t xml:space="preserve">, </w:t>
+      </w:r>
+      <w:r>
+        <w:rPr/>
+        <w:t xml:space="preserve">M365 Copilot</w:t>
+      </w:r>
+      <w:r>
+        <w:rPr/>
         <w:t xml:space="preserve">,  </w:t>
       </w:r>
       <w:r>
         <w:rPr/>
-        <w:t xml:space="preserve">Copilot Studio</w:t>
+        <w:t xml:space="preserve">Power Platform</w:t>
       </w:r>
       <w:r>
         <w:rPr/>
@@ -7185,6 +7201,14 @@
       </w:r>
       <w:r>
         <w:rPr/>
+        <w:t xml:space="preserve">Custom Agent</w:t>
+      </w:r>
+      <w:r>
+        <w:rPr/>
+        <w:t xml:space="preserve">) — the kinds whose traffic can be attributed  to agents — and the infrastructure kinds (</w:t>
+      </w:r>
+      <w:r>
+        <w:rPr/>
         <w:t xml:space="preserve">MCP Server</w:t>
       </w:r>
       <w:r>
@@ -7213,7 +7237,7 @@
       </w:r>
       <w:r>
         <w:rPr/>
-        <w:t xml:space="preserve">), an endpoint URL and free-form  metadata pairs such as Environment or Authentication.</w:t>
+        <w:t xml:space="preserve">), which cannot host an agent and are  governed through their tools instead.</w:t>
       </w:r>
     </w:p>
     <w:p>
@@ -7703,6 +7727,55 @@
       <w:r>
         <w:rPr/>
         <w:t xml:space="preserve">), provider, risk level,  access level (Read, Read-Write, Admin), data classification, auth mode, endpoint URL and scopes.</w:t>
+      </w:r>
+    </w:p>
+    <w:p>
+      <w:pPr>
+        <w:spacing w:lineRule="auto"/>
+      </w:pPr>
+      <w:r>
+        <w:rPr/>
+        <w:t xml:space="preserve">Three further type values — </w:t>
+      </w:r>
+      <w:r>
+        <w:rPr/>
+        <w:t xml:space="preserve">Connector</w:t>
+      </w:r>
+      <w:r>
+        <w:rPr/>
+        <w:t xml:space="preserve">, </w:t>
+      </w:r>
+      <w:r>
+        <w:rPr/>
+        <w:t xml:space="preserve">Data Source</w:t>
+      </w:r>
+      <w:r>
+        <w:rPr/>
+        <w:t xml:space="preserve"> and  </w:t>
+      </w:r>
+      <w:r>
+        <w:rPr/>
+        <w:t xml:space="preserve">Tool</w:t>
+      </w:r>
+      <w:r>
+        <w:rPr/>
+        <w:t xml:space="preserve"> — are legacy groupings: the dialog no longer offers them, but rows registered  through the API may still carry them and the tab filters still honour them. Treat a  </w:t>
+      </w:r>
+      <w:r>
+        <w:rPr/>
+        <w:t xml:space="preserve">Tool</w:t>
+      </w:r>
+      <w:r>
+        <w:rPr/>
+        <w:t xml:space="preserve"> row as a </w:t>
+      </w:r>
+      <w:r>
+        <w:rPr/>
+        <w:t xml:space="preserve">Custom Tool</w:t>
+      </w:r>
+      <w:r>
+        <w:rPr/>
+        <w:t xml:space="preserve"> that predates the current vocabulary.</w:t>
       </w:r>
     </w:p>
     <w:p>

</xml_diff>